<commit_message>
Strip the appendix back to the calendar
Removed the subtitle, the two explanatory paragraphs beneath the grid,
and the row of statistic tiles. What is left is the title, a legend
and the twelve months.

The legend is three keys rather than four, and the split squares are
gone with it. A weekday when neither of us is working now reads simply
as a day at home, which is what it is from the clinic's point of view,
so the calendar carries three states instead of four and needs no
explanation underneath.

Replaces the earlier appendix variant, which was the working artifact
with its planning notes trimmed rather than a figure built for the
document.

Co-Authored-By: Claude Opus 5 <noreply@anthropic.com>
Claude-Session: https://claude.ai/code/session_01BiwvkWimMBWVAQ22XxpJKd
</commit_message>
<xml_diff>
--- a/docs/fchc/FCHC-proposal.docx
+++ b/docs/fchc/FCHC-proposal.docx
@@ -1178,7 +1178,7 @@
       <w:r>
         <w:drawing>
           <wp:inline distT="0" distB="0" distL="0" distR="0">
-            <wp:extent cx="6667500" cy="7486650"/>
+            <wp:extent cx="6858000" cy="5486400"/>
             <wp:effectExtent t="0" r="0" b="0" l="0"/>
             <wp:docPr id="2" name=""/>
             <wp:cNvGraphicFramePr>
@@ -1203,7 +1203,7 @@
                   <pic:spPr bwMode="auto">
                     <a:xfrm>
                       <a:off x="0" y="0"/>
-                      <a:ext cx="6667500" cy="7486650"/>
+                      <a:ext cx="6858000" cy="5486400"/>
                     </a:xfrm>
                     <a:prstGeom prst="rect">
                       <a:avLst/>
@@ -1436,7 +1436,7 @@
         </w:rPr>
         <w:t xml:space="preserve">Overhead at 60 percent of collections. </w:t>
       </w:r>
-      <w:hyperlink w:history="1" r:id="rIdara9qtdfam35ds-v2djb4">
+      <w:hyperlink w:history="1" r:id="rId_kddolcp8m_dbdnrkyso1">
         <w:r>
           <w:rPr>
             <w:rFonts w:ascii="Arial" w:cs="Arial" w:eastAsia="Arial" w:hAnsi="Arial"/>
@@ -1474,7 +1474,7 @@
         </w:rPr>
         <w:t xml:space="preserve"/>
       </w:r>
-      <w:hyperlink w:history="1" r:id="rIdu7zc4nqkhcph2bvwfiwvp">
+      <w:hyperlink w:history="1" r:id="rIdmuw21fgc0-amqvn95vl_b">
         <w:r>
           <w:rPr>
             <w:rFonts w:ascii="Arial" w:cs="Arial" w:eastAsia="Arial" w:hAnsi="Arial"/>

</xml_diff>